<commit_message>
Refactor project structure and update documentation
- Updated TissisChanges.docx and TissisChanges.md to reflect changes in methodology, thresholds, and metrics based on feedback.
- Removed flow sensor and hopper lid automation from design, simplifying hardware and reducing potential failure points.
- Relocated solenoid valve to feeder modules to improve feed delivery efficiency.
- Enhanced the Kiosk Dashboard's CSS for improved visual aesthetics.
- Introduced a new file structure plan for the website prototype, detailing responsibilities for each module and migration strategy.
</commit_message>
<xml_diff>
--- a/TissisChanges.docx
+++ b/TissisChanges.docx
@@ -1512,53 +1512,7 @@
         </w:rPr>
       </w:pPr>
       <w:r>
-        <w:rPr>
-          <w:rFonts w:ascii="Roboto Medium" w:cs="Roboto Medium" w:eastAsia="Roboto Medium" w:hAnsi="Roboto Medium"/>
-          <w:i w:val="1"/>
-          <w:iCs w:val="1"/>
-          <w:color w:val="b8622a"/>
-          <w:sz w:val="21"/>
-          <w:szCs w:val="21"/>
-          <w:highlight w:val="white"/>
-          <w:rtl w:val="0"/>
-        </w:rPr>
-        <w:t xml:space="preserve">General comment on the manuscript — particularly Sections VI and VII: Several quantitative thresholds and technical claims (e.g., the 25 ppm NH</w:t>
-      </w:r>
-      <w:r>
-        <w:rPr>
-          <w:rFonts w:ascii="Roboto Medium" w:cs="Roboto Medium" w:eastAsia="Roboto Medium" w:hAnsi="Roboto Medium"/>
-          <w:i w:val="1"/>
-          <w:iCs w:val="1"/>
-          <w:color w:val="b8622a"/>
-          <w:sz w:val="21"/>
-          <w:szCs w:val="21"/>
-          <w:highlight w:val="white"/>
-          <w:vertAlign w:val="subscript"/>
-          <w:rtl w:val="0"/>
-        </w:rPr>
-        <w:t xml:space="preserve">3</w:t>
-      </w:r>
-      <w:r>
-        <w:rPr>
-          <w:rFonts w:ascii="Roboto Medium" w:cs="Roboto Medium" w:eastAsia="Roboto Medium" w:hAnsi="Roboto Medium"/>
-          <w:i w:val="1"/>
-          <w:iCs w:val="1"/>
-          <w:color w:val="b8622a"/>
-          <w:sz w:val="21"/>
-          <w:szCs w:val="21"/>
-          <w:highlight w:val="white"/>
-          <w:rtl w:val="0"/>
-        </w:rPr>
-        <w:t xml:space="preserve"> alarm level, the 95% FDA threshold, the ≤ 2 s latency criterion, the 95% uptime standard) lacked supporting citations or literature-backed justification. The panel recommended that all stated values and benchmarks be grounded in related literature or explicitly justified.</w:t>
-      </w:r>
-      <w:r>
-        <w:rPr>
-          <w:rFonts w:ascii="Roboto Medium" w:cs="Roboto Medium" w:eastAsia="Roboto Medium" w:hAnsi="Roboto Medium"/>
-          <w:sz w:val="21"/>
-          <w:szCs w:val="21"/>
-          <w:rtl w:val="0"/>
-        </w:rPr>
-        <w:t xml:space="preserve"> </w:t>
+        <w:t xml:space="preserve">General comment on the manuscript — particularly Chapters VI and VII: Several quantitative thresholds and technical claims (e.g., the 25 ppm NH3 alarm level, the 95% FDA threshold, the ≤ 2 s latency criterion, the 95% uptime standard) lacked supporting citations or literature-backed justification. The panel recommended that all stated values and benchmarks be grounded in related literature or explicitly justified. </w:t>
       </w:r>
     </w:p>
     <w:p>
@@ -2141,23 +2095,7 @@
         </w:rPr>
       </w:pPr>
       <w:r>
-        <w:rPr>
-          <w:rFonts w:ascii="Roboto Medium" w:cs="Roboto Medium" w:eastAsia="Roboto Medium" w:hAnsi="Roboto Medium"/>
-          <w:sz w:val="21"/>
-          <w:szCs w:val="21"/>
-          <w:rtl w:val="0"/>
-        </w:rPr>
-        <w:t xml:space="preserve">Thank you for pointing this out. I/We agree with this recommendation. Therefore, I/we added a dedicated threshold-baseline discussion in the methodology. For feeding, the normal baseline is now defined using the previous 14 completed feeding sessions, with alerts generated when current consumption falls outside the rolling-window statistical band. Additional warning and critical conditions were added, including a warning when consumption falls at least 20% below the rolling mean for two consecutive scheduled feedings and a critical alert when consumption falls at least 30% below the rolling mean or when no measurable feed reduction is detected after a scheduled feeding interval. For water level, the system now defines a normal operating band of 50–100% of calibrated trough depth, a refill trigger below 40%, and a critical alert below 30% if the condition remains unresolved after the refill command. For air quality, the manuscript now defines normal, caution, warning, and critical ammonia bands, with 25 ppm or higher treated as a critical threshold requiring caretaker inspection. </w:t>
-      </w:r>
-      <w:r>
-        <w:rPr>
-          <w:rFonts w:ascii="Roboto Medium" w:cs="Roboto Medium" w:eastAsia="Roboto Medium" w:hAnsi="Roboto Medium"/>
-          <w:color w:val="b8622a"/>
-          <w:sz w:val="21"/>
-          <w:szCs w:val="21"/>
-          <w:rtl w:val="0"/>
-        </w:rPr>
-        <w:t xml:space="preserve">Changes can be found in Chapter III (Goals and Objectives), Objective 2, Chapter VII-J (Consumption Baseline and Anomaly Detection), under Target Threshold Baselines for Validation, and Section ;VII-L, Test 2.4 – Threshold Baseline Validation. </w:t>
+        <w:t xml:space="preserve">Thank you for pointing this out. I/We agree with this recommendation. Therefore, I/we added a dedicated threshold-baseline discussion in the methodology. For feeding, the normal baseline is now defined using the previous 14 completed feeding sessions, with alerts generated when current consumption falls outside the rolling-window statistical band. Additional warning and critical conditions were added, including a warning when consumption falls at least 20% below the rolling mean for two consecutive scheduled feedings and a critical alert when consumption falls at least 30% below the rolling mean or when no measurable feed reduction is detected after a scheduled feeding interval. For water level, the system now defines a normal operating band of 50–100% of calibrated trough depth, a refill trigger below 40%, and a critical alert below 30% if the condition remains unresolved after the refill command. For air quality, the manuscript now defines normal, caution, warning, and critical ammonia bands, with 25 ppm or higher treated as a critical threshold requiring caretaker inspection. Changes can be found in Chapter III (Goals and Objectives), Objective 2, Chapter VII-J (Consumption Baseline and Anomaly Detection), under Target Threshold Baselines for Validation, and Chapter ;VII-L, Test 2.4 – Threshold Baseline Validation. </w:t>
       </w:r>
     </w:p>
     <w:p>
@@ -3538,6 +3476,24 @@
           <w:i/>
         </w:rPr>
         <w:t>This change can be found in Chapter VII-A (Conceptual Framework), Layer 3 – Actuation (Output), Page 2, Paragraph 2; Chapter VII-I (Dashboard User Interface Design), Pen Control Screen subsection (Manual Override (RA0) Button), Page 11; and Chapter VII-I, Manual Override (RA0) Dispensing Screen (Screen 5), Page 12.</w:t>
+      </w:r>
+    </w:p>
+    <w:p>
+      <w:r>
+        <w:br/>
+        <w:t>23. ***The water flow sensor (YF‑S201) and associated flow‑meter based volume measurement have been removed from the design.***</w:t>
+        <w:br/>
+        <w:t>**Response:** [Flow sensor removal] We removed all references to the YF‑S201 flow sensor and replaced water‑dispensing control with ultrasonic level‑sensor‑based monitoring. The manual “Dispense Water” screen now sets a target fill level percentage, and the system opens the solenoid valve until the ultrasonic sensor indicates the desired level is reached. This simplifies hardware, reduces cost, and eliminates reliance on pulse counting. *Changes are reflected in Section VII‑A (Conceptual Framework), Layer 2 (Processing), and Section VII‑I (Dashboard UI) where the water‑dispense flow‑meter reference was removed.*</w:t>
+        <w:br/>
+        <w:br/>
+        <w:t>24. ***The automated hinged hopper lid and its servo actuation have been eliminated.***</w:t>
+        <w:br/>
+        <w:t>**Response:** [Hopper lid automation removal] The hopper lid is now a manually operated component for feed replenishment. All descriptions of a servo‑driven lid and associated figures have been removed. This simplifies the mechanical design and removes a potential point of failure in the humid, ammonia‑rich environment. *Updates are in Section VII‑A (Conceptual Framework) and the dispensing mechanism description where the lid actuation sentence was removed.*</w:t>
+        <w:br/>
+        <w:br/>
+        <w:t>25. ***The solenoid‑actuated sliding plate valve has been relocated from the hopper bottom to individual feeder modules.***</w:t>
+        <w:br/>
+        <w:t>**Response:** [Solenoid valve relocation] The design now uses a solenoid cutoff valve at each feeder module’s trough inlet, ensuring any feed present in the pipe is fully delivered before valve closure, preventing excess feed waste. The hopper bottom aperture now feeds directly into the auger. Corresponding text in Section VII‑A (Actuation) and the dispensing mechanism has been revised accordingly.</w:t>
       </w:r>
     </w:p>
     <w:sectPr>

</xml_diff>